<commit_message>
Privacy policy draft v2: accounts, payment providers, analytics and overseas storage answers applied
Co-Authored-By: Claude Sonnet 5.5 <noreply@anthropic.com>
</commit_message>
<xml_diff>
--- a/docs/policy-drafts/privacy-policy.docx
+++ b/docs/policy-drafts/privacy-policy.docx
@@ -35,7 +35,7 @@
           <w:sz w:val="20"/>
           <w:szCs w:val="20"/>
         </w:rPr>
-        <w:t xml:space="preserve">Draft for review (version 1).</w:t>
+        <w:t xml:space="preserve">Draft for review (version 2).</w:t>
       </w:r>
       <w:r>
         <w:rPr>
@@ -253,16 +253,7 @@
         <w:rPr>
           <w:rFonts w:ascii="Arial" w:cs="Arial" w:eastAsia="Arial" w:hAnsi="Arial"/>
         </w:rPr>
-        <w:t xml:space="preserve"> if you create an account, your login details and order history </w:t>
-      </w:r>
-      <w:r>
-        <w:rPr>
-          <w:rFonts w:ascii="Arial" w:cs="Arial" w:eastAsia="Arial" w:hAnsi="Arial"/>
-          <w:b/>
-          <w:bCs/>
-          <w:shd w:fill="FFF2B3" w:color="auto" w:val="clear"/>
-        </w:rPr>
-        <w:t xml:space="preserve">[CONFIRM: whether customers can create accounts]</w:t>
+        <w:t xml:space="preserve"> if you create an account, your name, email address and order history, which you can see when you sign in</w:t>
       </w:r>
     </w:p>
     <w:p>
@@ -358,16 +349,7 @@
         <w:rPr>
           <w:rFonts w:ascii="Arial" w:cs="Arial" w:eastAsia="Arial" w:hAnsi="Arial"/>
         </w:rPr>
-        <w:t xml:space="preserve"> whether you have signed up to or opted out of our emails </w:t>
-      </w:r>
-      <w:r>
-        <w:rPr>
-          <w:rFonts w:ascii="Arial" w:cs="Arial" w:eastAsia="Arial" w:hAnsi="Arial"/>
-          <w:b/>
-          <w:bCs/>
-          <w:shd w:fill="FFF2B3" w:color="auto" w:val="clear"/>
-        </w:rPr>
-        <w:t xml:space="preserve">[CONFIRM: whether you run a newsletter]</w:t>
+        <w:t xml:space="preserve"> whether you have agreed to receive marketing from us, or have opted out</w:t>
       </w:r>
     </w:p>
     <w:p>
@@ -643,16 +625,7 @@
         <w:rPr>
           <w:rFonts w:ascii="Arial" w:cs="Arial" w:eastAsia="Arial" w:hAnsi="Arial"/>
         </w:rPr>
-        <w:t xml:space="preserve">, to process your payment (for example Shopify Payments, PayPal and Afterpay) </w:t>
-      </w:r>
-      <w:r>
-        <w:rPr>
-          <w:rFonts w:ascii="Arial" w:cs="Arial" w:eastAsia="Arial" w:hAnsi="Arial"/>
-          <w:b/>
-          <w:bCs/>
-          <w:shd w:fill="FFF2B3" w:color="auto" w:val="clear"/>
-        </w:rPr>
-        <w:t xml:space="preserve">[CONFIRM your providers]</w:t>
+        <w:t xml:space="preserve">, to process your payment (Shopify Payments, PayPal and Afterpay)</w:t>
       </w:r>
     </w:p>
     <w:p>
@@ -700,16 +673,7 @@
         <w:rPr>
           <w:rFonts w:ascii="Arial" w:cs="Arial" w:eastAsia="Arial" w:hAnsi="Arial"/>
         </w:rPr>
-        <w:t xml:space="preserve">, such as email, website analytics, advertising and photo-upload tools </w:t>
-      </w:r>
-      <w:r>
-        <w:rPr>
-          <w:rFonts w:ascii="Arial" w:cs="Arial" w:eastAsia="Arial" w:hAnsi="Arial"/>
-          <w:b/>
-          <w:bCs/>
-          <w:shd w:fill="FFF2B3" w:color="auto" w:val="clear"/>
-        </w:rPr>
-        <w:t xml:space="preserve">[CONFIRM which you use, for example Google Analytics, Google Forms and Meta]</w:t>
+        <w:t xml:space="preserve">, such as email, website analytics, advertising and photo-upload tools - these may include Google (such as Google Analytics and Google Forms) and Meta (Facebook and Instagram)</w:t>
       </w:r>
     </w:p>
     <w:p>
@@ -785,22 +749,7 @@
         <w:rPr>
           <w:rFonts w:ascii="Arial" w:cs="Arial" w:eastAsia="Arial" w:hAnsi="Arial"/>
         </w:rPr>
-        <w:t xml:space="preserve">Our website uses cookies and similar technologies. Some are needed for the site to work, such as keeping items in your cart and keeping checkout secure. Others help us understand how the site is used, or show you relevant advertising </w:t>
-      </w:r>
-      <w:r>
-        <w:rPr>
-          <w:rFonts w:ascii="Arial" w:cs="Arial" w:eastAsia="Arial" w:hAnsi="Arial"/>
-          <w:b/>
-          <w:bCs/>
-          <w:shd w:fill="FFF2B3" w:color="auto" w:val="clear"/>
-        </w:rPr>
-        <w:t xml:space="preserve">[CONFIRM whether you use advertising or analytics tools]</w:t>
-      </w:r>
-      <w:r>
-        <w:rPr>
-          <w:rFonts w:ascii="Arial" w:cs="Arial" w:eastAsia="Arial" w:hAnsi="Arial"/>
-        </w:rPr>
-        <w:t xml:space="preserve">.</w:t>
+        <w:t xml:space="preserve">Our website uses cookies and similar technologies. Some are needed for the site to work, such as keeping items in your cart and keeping checkout secure. Others help us understand how the site is used, or show you relevant advertising.</w:t>
       </w:r>
     </w:p>
     <w:p>
@@ -909,16 +858,7 @@
         <w:rPr>
           <w:rFonts w:ascii="Arial" w:cs="Arial" w:eastAsia="Arial" w:hAnsi="Arial"/>
         </w:rPr>
-        <w:t xml:space="preserve">Some of the services we use, such as Shopify and Google, store and process information outside Australia, including in countries such as Canada and the United States. We choose reputable providers, but we cannot control how overseas providers handle data beyond our agreements with them. </w:t>
-      </w:r>
-      <w:r>
-        <w:rPr>
-          <w:rFonts w:ascii="Arial" w:cs="Arial" w:eastAsia="Arial" w:hAnsi="Arial"/>
-          <w:b/>
-          <w:bCs/>
-          <w:shd w:fill="FFF2B3" w:color="auto" w:val="clear"/>
-        </w:rPr>
-        <w:t xml:space="preserve">[CONFIRM list of providers and countries.]</w:t>
+        <w:t xml:space="preserve">Some of the services we use, such as Shopify and Google, store and process information outside Australia, including in countries such as Canada and the United States. We choose reputable providers, but we cannot control how overseas providers handle data beyond our agreements with them.</w:t>
       </w:r>
     </w:p>
     <w:p>
@@ -957,36 +897,7 @@
         <w:rPr>
           <w:rFonts w:ascii="Arial" w:cs="Arial" w:eastAsia="Arial" w:hAnsi="Arial"/>
         </w:rPr>
-        <w:t xml:space="preserve">We keep your information only as long as we need it, for example to complete your order, provide warranty support and meet tax and accounting requirements. Business records are generally kept for </w:t>
-      </w:r>
-      <w:r>
-        <w:rPr>
-          <w:rFonts w:ascii="Arial" w:cs="Arial" w:eastAsia="Arial" w:hAnsi="Arial"/>
-          <w:b/>
-          <w:bCs/>
-        </w:rPr>
-        <w:t xml:space="preserve">5 years</w:t>
-      </w:r>
-      <w:r>
-        <w:rPr>
-          <w:rFonts w:ascii="Arial" w:cs="Arial" w:eastAsia="Arial" w:hAnsi="Arial"/>
-        </w:rPr>
-        <w:t xml:space="preserve">. </w:t>
-      </w:r>
-      <w:r>
-        <w:rPr>
-          <w:rFonts w:ascii="Arial" w:cs="Arial" w:eastAsia="Arial" w:hAnsi="Arial"/>
-          <w:b/>
-          <w:bCs/>
-          <w:shd w:fill="FFF2B3" w:color="auto" w:val="clear"/>
-        </w:rPr>
-        <w:t xml:space="preserve">[CONFIRM.]</w:t>
-      </w:r>
-      <w:r>
-        <w:rPr>
-          <w:rFonts w:ascii="Arial" w:cs="Arial" w:eastAsia="Arial" w:hAnsi="Arial"/>
-        </w:rPr>
-        <w:t xml:space="preserve"> When we no longer need it, we delete it or make it anonymous.</w:t>
+        <w:t xml:space="preserve">We keep your information only as long as we need it, for example to complete your order, provide warranty support and meet tax and accounting requirements. Business records are generally kept for 5 years. When we no longer need it, we delete it or make it anonymous.</w:t>
       </w:r>
     </w:p>
     <w:p>

</xml_diff>